<commit_message>
feat(portfolio): update Swiss Ephemeris project to JME Ephemeris with enhanced features and new SDK ecosystem
</commit_message>
<xml_diff>
--- a/cv.docx
+++ b/cv.docx
@@ -682,7 +682,7 @@
           <w:i/>
           <w:sz w:val="20"/>
         </w:rPr>
-        <w:t>PHP, FFI, Swiss Ephemeris</w:t>
+        <w:t>PHP, FFI, JME Ephemeris</w:t>
       </w:r>
     </w:p>
     <w:p>
@@ -696,7 +696,7 @@
         </w:rPr>
         <w:t>•</w:t>
         <w:tab/>
-        <w:t>Architected a high-precision Hindu calendar engine using a Swiss Ephemeris C-FFI bridge and IEEE 754 doubles to compute Tithi, Nakṣatra, Yoga, Karaṇa, and 30 Muhūrtas with 0.001 arcsecond accuracy.</w:t>
+        <w:t>Architected a high-precision Hindu calendar engine using a JME Ephemeris FFI bridge and IEEE 754 doubles to compute Tithi, Nakṣatra, Yoga, Karaṇa, and 30 Muhūrtas with 0.001 arcsecond accuracy.</w:t>
       </w:r>
     </w:p>
     <w:p>
@@ -710,7 +710,7 @@
         </w:rPr>
         <w:t>•</w:t>
         <w:tab/>
-        <w:t>Implemented KalaNirnaya logic orchestrating 237 regional festivals (Smarta/Vaishnava) across Amanta/Purnimanta calendars with English, Hindi, and Gujarati output.</w:t>
+        <w:t>Implemented KalaNirnaya logic orchestrating 323 unique festivals and 85 unique vrat identities across Amanta/Purnimanta calendars with English, Hindi, and Gujarati output.</w:t>
       </w:r>
     </w:p>
     <w:p>
@@ -740,7 +740,7 @@
         <w:rPr>
           <w:b/>
         </w:rPr>
-        <w:t>Swiss Ephemeris FFI</w:t>
+        <w:t>JME Ephemeris Engine</w:t>
       </w:r>
       <w:r>
         <w:tab/>
@@ -751,19 +751,7 @@
             <w:color w:val="0046B4"/>
             <w:u w:val="single"/>
           </w:rPr>
-          <w:t>GitHub (PHP)</w:t>
-        </w:r>
-      </w:hyperlink>
-      <w:r>
-        <w:t xml:space="preserve"> | </w:t>
-      </w:r>
-      <w:hyperlink r:id="rId14">
-        <w:r>
-          <w:rPr>
-            <w:color w:val="0046B4"/>
-            <w:u w:val="single"/>
-          </w:rPr>
-          <w:t>GitHub (Python)</w:t>
+          <w:t>GitHub</w:t>
         </w:r>
       </w:hyperlink>
     </w:p>
@@ -778,7 +766,7 @@
           <w:i/>
           <w:sz w:val="20"/>
         </w:rPr>
-        <w:t>PHP, Python, FFI, ctypes, C</w:t>
+        <w:t>C, Astronomy, JPL, CALCEPH</w:t>
       </w:r>
     </w:p>
     <w:p>
@@ -792,7 +780,7 @@
         </w:rPr>
         <w:t>•</w:t>
         <w:tab/>
-        <w:t>Published zero-abstraction 1:1 FFI libraries for the Swiss Ephemeris C API (106 functions, 348 constants) as two sibling packages: PHP via ext-ffi and Python via ctypes, both on Packagist and PyPI.</w:t>
+        <w:t>Developed an independent MIT-licensed ephemeris engine with 204 public functions and 462 constants.</w:t>
       </w:r>
     </w:p>
     <w:p>
@@ -806,7 +794,143 @@
         </w:rPr>
         <w:t>•</w:t>
         <w:tab/>
-        <w:t>Bundled prebuilt .so/.dylib/.dll binaries for Linux, macOS, and Windows (x64/arm64) directly in each package wheel, eliminating manual C compilation for end users.</w:t>
+        <w:t>Implemented multiple computation backends including JPL/CALCEPH, Moshier, VSOP87, ELP2000, and Meeus.</w:t>
+      </w:r>
+    </w:p>
+    <w:p>
+      <w:pPr>
+        <w:spacing w:after="40" w:before="0" w:line="240" w:lineRule="auto"/>
+        <w:ind w:left="360" w:hanging="216"/>
+      </w:pPr>
+      <w:r>
+        <w:rPr>
+          <w:sz w:val="20"/>
+        </w:rPr>
+        <w:t>•</w:t>
+        <w:tab/>
+        <w:t>Designed strict engine-selection architecture supporting JPL, MOSHIER, VSOP_ELP_MEEUS, and AUTO modes.</w:t>
+      </w:r>
+    </w:p>
+    <w:p>
+      <w:pPr>
+        <w:spacing w:after="40" w:before="0" w:line="240" w:lineRule="auto"/>
+        <w:ind w:left="360" w:hanging="216"/>
+      </w:pPr>
+      <w:r>
+        <w:rPr>
+          <w:sz w:val="20"/>
+        </w:rPr>
+        <w:t>•</w:t>
+        <w:tab/>
+        <w:t>Built the native foundation powering PHP, Python, and Dart language ecosystems.</w:t>
+      </w:r>
+    </w:p>
+    <w:p>
+      <w:pPr>
+        <w:keepNext/>
+        <w:tabs>
+          <w:tab w:pos="10181" w:val="right"/>
+        </w:tabs>
+        <w:spacing w:before="280" w:after="0" w:line="240" w:lineRule="auto"/>
+        <w:ind w:left="0"/>
+      </w:pPr>
+      <w:r>
+        <w:rPr>
+          <w:b/>
+        </w:rPr>
+        <w:t>JME Cross-Language SDK Ecosystem</w:t>
+      </w:r>
+      <w:r>
+        <w:tab/>
+      </w:r>
+      <w:hyperlink r:id="rId14">
+        <w:r>
+          <w:rPr>
+            <w:color w:val="0046B4"/>
+            <w:u w:val="single"/>
+          </w:rPr>
+          <w:t>GitHub (PHP)</w:t>
+        </w:r>
+      </w:hyperlink>
+      <w:r>
+        <w:t xml:space="preserve"> | </w:t>
+      </w:r>
+      <w:hyperlink r:id="rId15">
+        <w:r>
+          <w:rPr>
+            <w:color w:val="0046B4"/>
+            <w:u w:val="single"/>
+          </w:rPr>
+          <w:t>GitHub (Python)</w:t>
+        </w:r>
+      </w:hyperlink>
+      <w:r>
+        <w:t xml:space="preserve"> | </w:t>
+      </w:r>
+      <w:hyperlink r:id="rId16">
+        <w:r>
+          <w:rPr>
+            <w:color w:val="0046B4"/>
+            <w:u w:val="single"/>
+          </w:rPr>
+          <w:t>GitHub (Dart)</w:t>
+        </w:r>
+      </w:hyperlink>
+    </w:p>
+    <w:p>
+      <w:pPr>
+        <w:keepNext/>
+        <w:spacing w:after="80" w:line="240" w:lineRule="auto"/>
+        <w:ind w:left="0"/>
+      </w:pPr>
+      <w:r>
+        <w:rPr>
+          <w:i/>
+          <w:sz w:val="20"/>
+        </w:rPr>
+        <w:t>PHP, Python, Dart, C</w:t>
+      </w:r>
+    </w:p>
+    <w:p>
+      <w:pPr>
+        <w:spacing w:after="40" w:before="0" w:line="240" w:lineRule="auto"/>
+        <w:ind w:left="360" w:hanging="216"/>
+      </w:pPr>
+      <w:r>
+        <w:rPr>
+          <w:sz w:val="20"/>
+        </w:rPr>
+        <w:t>•</w:t>
+        <w:tab/>
+        <w:t>Published native bindings and packaged runtimes across PHP, Python, and Flutter/Dart.</w:t>
+      </w:r>
+    </w:p>
+    <w:p>
+      <w:pPr>
+        <w:spacing w:after="40" w:before="0" w:line="240" w:lineRule="auto"/>
+        <w:ind w:left="360" w:hanging="216"/>
+      </w:pPr>
+      <w:r>
+        <w:rPr>
+          <w:sz w:val="20"/>
+        </w:rPr>
+        <w:t>•</w:t>
+        <w:tab/>
+        <w:t>Delivered consistent access to the same C API across multiple programming languages and operating systems.</w:t>
+      </w:r>
+    </w:p>
+    <w:p>
+      <w:pPr>
+        <w:spacing w:after="40" w:before="0" w:line="240" w:lineRule="auto"/>
+        <w:ind w:left="360" w:hanging="216"/>
+      </w:pPr>
+      <w:r>
+        <w:rPr>
+          <w:sz w:val="20"/>
+        </w:rPr>
+        <w:t>•</w:t>
+        <w:tab/>
+        <w:t>Eliminated manual compilation by distributing platform-specific binaries for end users.</w:t>
       </w:r>
     </w:p>
     <w:p>
@@ -827,7 +951,7 @@
       <w:r>
         <w:tab/>
       </w:r>
-      <w:hyperlink r:id="rId15">
+      <w:hyperlink r:id="rId17">
         <w:r>
           <w:rPr>
             <w:color w:val="0046B4"/>
@@ -839,7 +963,7 @@
       <w:r>
         <w:t xml:space="preserve"> | </w:t>
       </w:r>
-      <w:hyperlink r:id="rId16">
+      <w:hyperlink r:id="rId18">
         <w:r>
           <w:rPr>
             <w:color w:val="0046B4"/>
@@ -909,7 +1033,7 @@
       <w:r>
         <w:tab/>
       </w:r>
-      <w:hyperlink r:id="rId17">
+      <w:hyperlink r:id="rId19">
         <w:r>
           <w:rPr>
             <w:color w:val="0046B4"/>
@@ -921,7 +1045,7 @@
       <w:r>
         <w:t xml:space="preserve"> | </w:t>
       </w:r>
-      <w:hyperlink r:id="rId18">
+      <w:hyperlink r:id="rId20">
         <w:r>
           <w:rPr>
             <w:color w:val="0046B4"/>
@@ -991,7 +1115,7 @@
       <w:r>
         <w:tab/>
       </w:r>
-      <w:hyperlink r:id="rId19">
+      <w:hyperlink r:id="rId21">
         <w:r>
           <w:rPr>
             <w:color w:val="0046B4"/>
@@ -1047,7 +1171,7 @@
       <w:r>
         <w:tab/>
       </w:r>
-      <w:hyperlink r:id="rId20">
+      <w:hyperlink r:id="rId22">
         <w:r>
           <w:rPr>
             <w:color w:val="0046B4"/>
@@ -1103,7 +1227,7 @@
       <w:r>
         <w:tab/>
       </w:r>
-      <w:hyperlink r:id="rId21">
+      <w:hyperlink r:id="rId23">
         <w:r>
           <w:rPr>
             <w:color w:val="0046B4"/>
@@ -1173,7 +1297,7 @@
       <w:r>
         <w:tab/>
       </w:r>
-      <w:hyperlink r:id="rId22">
+      <w:hyperlink r:id="rId24">
         <w:r>
           <w:rPr>
             <w:color w:val="0046B4"/>
@@ -1185,7 +1309,7 @@
       <w:r>
         <w:t xml:space="preserve"> | </w:t>
       </w:r>
-      <w:hyperlink r:id="rId23">
+      <w:hyperlink r:id="rId25">
         <w:r>
           <w:rPr>
             <w:color w:val="0046B4"/>
@@ -1241,7 +1365,7 @@
       <w:r>
         <w:tab/>
       </w:r>
-      <w:hyperlink r:id="rId24">
+      <w:hyperlink r:id="rId26">
         <w:r>
           <w:rPr>
             <w:color w:val="0046B4"/>
@@ -1297,7 +1421,7 @@
       <w:r>
         <w:tab/>
       </w:r>
-      <w:hyperlink r:id="rId25">
+      <w:hyperlink r:id="rId27">
         <w:r>
           <w:rPr>
             <w:color w:val="0046B4"/>
@@ -1309,7 +1433,7 @@
       <w:r>
         <w:t xml:space="preserve"> | </w:t>
       </w:r>
-      <w:hyperlink r:id="rId26">
+      <w:hyperlink r:id="rId28">
         <w:r>
           <w:rPr>
             <w:color w:val="0046B4"/>
@@ -1437,7 +1561,7 @@
         <w:t>•</w:t>
         <w:tab/>
       </w:r>
-      <w:hyperlink r:id="rId27">
+      <w:hyperlink r:id="rId29">
         <w:r>
           <w:rPr>
             <w:color w:val="0046B4"/>
@@ -1456,7 +1580,7 @@
         <w:t>•</w:t>
         <w:tab/>
       </w:r>
-      <w:hyperlink r:id="rId28">
+      <w:hyperlink r:id="rId30">
         <w:r>
           <w:rPr>
             <w:color w:val="0046B4"/>
@@ -1475,7 +1599,7 @@
         <w:t>•</w:t>
         <w:tab/>
       </w:r>
-      <w:hyperlink r:id="rId29">
+      <w:hyperlink r:id="rId31">
         <w:r>
           <w:rPr>
             <w:color w:val="0046B4"/>
@@ -1494,7 +1618,7 @@
         <w:t>•</w:t>
         <w:tab/>
       </w:r>
-      <w:hyperlink r:id="rId30">
+      <w:hyperlink r:id="rId32">
         <w:r>
           <w:rPr>
             <w:color w:val="0046B4"/>
@@ -1513,7 +1637,7 @@
         <w:t>•</w:t>
         <w:tab/>
       </w:r>
-      <w:hyperlink r:id="rId31">
+      <w:hyperlink r:id="rId33">
         <w:r>
           <w:rPr>
             <w:color w:val="0046B4"/>
@@ -1532,7 +1656,7 @@
         <w:t>•</w:t>
         <w:tab/>
       </w:r>
-      <w:hyperlink r:id="rId32">
+      <w:hyperlink r:id="rId34">
         <w:r>
           <w:rPr>
             <w:color w:val="0046B4"/>

</xml_diff>